<commit_message>
Add Funnel B to Kade Dunstone personal brand strategy doc
The doc only described Funnel A (scorecard → consultation). Added Funnel
B (scorecard → free 14-Day Challenge → Blueprint ) alongside it and
regenerated the designed PDF + docx.

Co-Authored-By: Claude Opus 4.8 (1M context) <noreply@anthropic.com>
</commit_message>
<xml_diff>
--- a/public/docs/strategy/personal-brand/kade-dunstone-personal-brand-strategy-v1.docx
+++ b/public/docs/strategy/personal-brand/kade-dunstone-personal-brand-strategy-v1.docx
@@ -1366,55 +1366,7 @@
         <w:pStyle w:val="FirstParagraph"/>
       </w:pPr>
       <w:r>
-        <w:t xml:space="preserve">Ad or content → Body State Scorecard → Performance Check-In → Consultation → Client</w:t>
-      </w:r>
-    </w:p>
-    <w:p>
-      <w:pPr>
-        <w:pStyle w:val="BodyText"/>
-      </w:pPr>
-      <w:r>
-        <w:t xml:space="preserve">All traffic goes to the scorecard. Never direct to purchase.</w:t>
-      </w:r>
-    </w:p>
-    <w:bookmarkEnd w:id="23"/>
-    <w:bookmarkStart w:id="24" w:name="target-audience"/>
-    <w:p>
-      <w:pPr>
-        <w:pStyle w:val="Heading3"/>
-      </w:pPr>
-      <w:r>
-        <w:t xml:space="preserve">Target Audience</w:t>
-      </w:r>
-    </w:p>
-    <w:p>
-      <w:pPr>
-        <w:pStyle w:val="FirstParagraph"/>
-      </w:pPr>
-      <w:r>
-        <w:t xml:space="preserve">High-functioning adults 30-50. Corporate, finance, law, consulting, medical.</w:t>
-      </w:r>
-      <w:r>
-        <w:t xml:space="preserve"> </w:t>
-      </w:r>
-      <w:r>
-        <w:t xml:space="preserve">$100K-$180K+ AUD income. Disciplined. Frustrated. Not lazy.</w:t>
-      </w:r>
-      <w:r>
-        <w:t xml:space="preserve"> </w:t>
-      </w:r>
-      <w:r>
-        <w:t xml:space="preserve">Primary: Women 35-50. Secondary: Men 35-55.</w:t>
-      </w:r>
-    </w:p>
-    <w:bookmarkEnd w:id="24"/>
-    <w:bookmarkStart w:id="25" w:name="content-pillars-1"/>
-    <w:p>
-      <w:pPr>
-        <w:pStyle w:val="Heading3"/>
-      </w:pPr>
-      <w:r>
-        <w:t xml:space="preserve">Content Pillars</w:t>
+        <w:t xml:space="preserve">All traffic goes to the Body State Scorecard first. Never direct to purchase. From the scorecard, two funnels run in parallel:</w:t>
       </w:r>
     </w:p>
     <w:p>
@@ -1426,7 +1378,17 @@
         </w:numPr>
       </w:pPr>
       <w:r>
-        <w:t xml:space="preserve">Body State (Depleted, Transitioning, Ready)</w:t>
+        <w:rPr>
+          <w:b/>
+          <w:bCs/>
+        </w:rPr>
+        <w:t xml:space="preserve">Funnel A (consultation):</w:t>
+      </w:r>
+      <w:r>
+        <w:t xml:space="preserve"> </w:t>
+      </w:r>
+      <w:r>
+        <w:t xml:space="preserve">Scorecard → Performance Check-In → Consultation → coaching client. The warm, higher-touch path.</w:t>
       </w:r>
     </w:p>
     <w:p>
@@ -1438,53 +1400,35 @@
         </w:numPr>
       </w:pPr>
       <w:r>
-        <w:t xml:space="preserve">Why effort isn’t working</w:t>
-      </w:r>
-    </w:p>
-    <w:p>
-      <w:pPr>
-        <w:pStyle w:val="Compact"/>
-        <w:numPr>
-          <w:ilvl w:val="0"/>
-          <w:numId w:val="1003"/>
-        </w:numPr>
-      </w:pPr>
-      <w:r>
-        <w:t xml:space="preserve">Cortisol and fat storage</w:t>
-      </w:r>
-    </w:p>
-    <w:p>
-      <w:pPr>
-        <w:pStyle w:val="Compact"/>
-        <w:numPr>
-          <w:ilvl w:val="0"/>
-          <w:numId w:val="1003"/>
-        </w:numPr>
-      </w:pPr>
-      <w:r>
-        <w:t xml:space="preserve">Prescription without interpretation</w:t>
-      </w:r>
-    </w:p>
-    <w:p>
-      <w:pPr>
-        <w:pStyle w:val="Compact"/>
-        <w:numPr>
-          <w:ilvl w:val="0"/>
-          <w:numId w:val="1003"/>
-        </w:numPr>
-      </w:pPr>
-      <w:r>
-        <w:t xml:space="preserve">The intelligent approach</w:t>
-      </w:r>
-    </w:p>
-    <w:bookmarkEnd w:id="25"/>
-    <w:bookmarkStart w:id="26" w:name="posting-cadence-1"/>
+        <w:rPr>
+          <w:b/>
+          <w:bCs/>
+        </w:rPr>
+        <w:t xml:space="preserve">Funnel B (challenge):</w:t>
+      </w:r>
+      <w:r>
+        <w:t xml:space="preserve"> </w:t>
+      </w:r>
+      <w:r>
+        <w:t xml:space="preserve">Scorecard → free 14-Day Body Decode Challenge → the Blueprint ($97) → coaching / membership. The self-serve proof path - the free Challenge lets the read prove itself before any purchase.</w:t>
+      </w:r>
+    </w:p>
+    <w:p>
+      <w:pPr>
+        <w:pStyle w:val="FirstParagraph"/>
+      </w:pPr>
+      <w:r>
+        <w:t xml:space="preserve">The scorecard is the shared front door; the two funnels give both a direct consultation route and a low-friction, proof-first route.</w:t>
+      </w:r>
+    </w:p>
+    <w:bookmarkEnd w:id="23"/>
+    <w:bookmarkStart w:id="24" w:name="target-audience"/>
     <w:p>
       <w:pPr>
         <w:pStyle w:val="Heading3"/>
       </w:pPr>
       <w:r>
-        <w:t xml:space="preserve">Posting Cadence</w:t>
+        <w:t xml:space="preserve">Target Audience</w:t>
       </w:r>
     </w:p>
     <w:p>
@@ -1492,154 +1436,29 @@
         <w:pStyle w:val="FirstParagraph"/>
       </w:pPr>
       <w:r>
-        <w:t xml:space="preserve">5x per week:</w:t>
-      </w:r>
-      <w:r>
-        <w:t xml:space="preserve"> </w:t>
-      </w:r>
-      <w:r>
-        <w:t xml:space="preserve">- Monday: Authority (7am)</w:t>
-      </w:r>
-      <w:r>
-        <w:t xml:space="preserve"> </w:t>
-      </w:r>
-      <w:r>
-        <w:t xml:space="preserve">- Wednesday: Pattern Recognition (12pm)</w:t>
-      </w:r>
-      <w:r>
-        <w:t xml:space="preserve"> </w:t>
-      </w:r>
-      <w:r>
-        <w:t xml:space="preserve">- Friday: Coach Perspective (6pm)</w:t>
-      </w:r>
-      <w:r>
-        <w:t xml:space="preserve"> </w:t>
-      </w:r>
-      <w:r>
-        <w:t xml:space="preserve">- Sunday: Diagnostic - Scorecard CTA (8am)</w:t>
-      </w:r>
-      <w:r>
-        <w:t xml:space="preserve"> </w:t>
-      </w:r>
-      <w:r>
-        <w:t xml:space="preserve">- Tuesday or Thursday: Contrarian or Reels</w:t>
-      </w:r>
-    </w:p>
-    <w:bookmarkEnd w:id="26"/>
-    <w:bookmarkStart w:id="27" w:name="paid-ads"/>
+        <w:t xml:space="preserve">High-functioning adults 30-50. Corporate, finance, law, consulting, medical.</w:t>
+      </w:r>
+      <w:r>
+        <w:t xml:space="preserve"> </w:t>
+      </w:r>
+      <w:r>
+        <w:t xml:space="preserve">$100K-$180K+ AUD income. Disciplined. Frustrated. Not lazy.</w:t>
+      </w:r>
+      <w:r>
+        <w:t xml:space="preserve"> </w:t>
+      </w:r>
+      <w:r>
+        <w:t xml:space="preserve">Primary: Women 35-50. Secondary: Men 35-55.</w:t>
+      </w:r>
+    </w:p>
+    <w:bookmarkEnd w:id="24"/>
+    <w:bookmarkStart w:id="25" w:name="content-pillars-1"/>
     <w:p>
       <w:pPr>
         <w:pStyle w:val="Heading3"/>
       </w:pPr>
       <w:r>
-        <w:t xml:space="preserve">Paid Ads</w:t>
-      </w:r>
-    </w:p>
-    <w:p>
-      <w:pPr>
-        <w:pStyle w:val="FirstParagraph"/>
-      </w:pPr>
-      <w:r>
-        <w:t xml:space="preserve">3 ad sets running simultaneously at $10/day each ($30/day total):</w:t>
-      </w:r>
-      <w:r>
-        <w:t xml:space="preserve"> </w:t>
-      </w:r>
-      <w:r>
-        <w:t xml:space="preserve">- Silent Frustration — Statement card</w:t>
-      </w:r>
-      <w:r>
-        <w:t xml:space="preserve"> </w:t>
-      </w:r>
-      <w:r>
-        <w:t xml:space="preserve">- Contrarian — Photo card</w:t>
-      </w:r>
-      <w:r>
-        <w:t xml:space="preserve"> </w:t>
-      </w:r>
-      <w:r>
-        <w:t xml:space="preserve">- Diagnosis — Body states carousel (3 slides)</w:t>
-      </w:r>
-    </w:p>
-    <w:p>
-      <w:pPr>
-        <w:pStyle w:val="BodyText"/>
-      </w:pPr>
-      <w:r>
-        <w:t xml:space="preserve">All destination URLs tracked by source.</w:t>
-      </w:r>
-      <w:r>
-        <w:t xml:space="preserve"> </w:t>
-      </w:r>
-      <w:r>
-        <w:t xml:space="preserve">Run 14 days before evaluating. Cut 2 underperformers. Scale winner.</w:t>
-      </w:r>
-    </w:p>
-    <w:p>
-      <w:pPr>
-        <w:pStyle w:val="BodyText"/>
-      </w:pPr>
-      <w:r>
-        <w:t xml:space="preserve">Ads trigger: 3 scorecard submissions per week for 2 consecutive weeks.</w:t>
-      </w:r>
-    </w:p>
-    <w:p>
-      <w:r>
-        <w:pict>
-          <v:rect style="width:0;height:1.5pt" o:hralign="center" o:hrstd="t" o:hr="t"/>
-        </w:pict>
-      </w:r>
-    </w:p>
-    <w:bookmarkEnd w:id="27"/>
-    <w:bookmarkEnd w:id="28"/>
-    <w:bookmarkStart w:id="36" w:name="brand-3-ai-co-founder-method"/>
-    <w:p>
-      <w:pPr>
-        <w:pStyle w:val="Heading2"/>
-      </w:pPr>
-      <w:r>
-        <w:t xml:space="preserve">BRAND 3 — AI CO-FOUNDER METHOD</w:t>
-      </w:r>
-    </w:p>
-    <w:bookmarkStart w:id="29" w:name="positioning-2"/>
-    <w:p>
-      <w:pPr>
-        <w:pStyle w:val="Heading3"/>
-      </w:pPr>
-      <w:r>
-        <w:t xml:space="preserve">Positioning</w:t>
-      </w:r>
-    </w:p>
-    <w:p>
-      <w:pPr>
-        <w:pStyle w:val="FirstParagraph"/>
-      </w:pPr>
-      <w:r>
-        <w:t xml:space="preserve">A structured framework for founders and business leaders who want to use AI strategically — not randomly.</w:t>
-      </w:r>
-    </w:p>
-    <w:p>
-      <w:pPr>
-        <w:pStyle w:val="BodyText"/>
-      </w:pPr>
-      <w:r>
-        <w:t xml:space="preserve">Not a prompt guide. Not a tool tutorial.</w:t>
-      </w:r>
-      <w:r>
-        <w:t xml:space="preserve"> </w:t>
-      </w:r>
-      <w:r>
-        <w:t xml:space="preserve">A system for integrating AI as a thinking partner across the entire business.</w:t>
-      </w:r>
-    </w:p>
-    <w:bookmarkEnd w:id="29"/>
-    <w:bookmarkStart w:id="30" w:name="product"/>
-    <w:p>
-      <w:pPr>
-        <w:pStyle w:val="Heading3"/>
-      </w:pPr>
-      <w:r>
-        <w:t xml:space="preserve">Product</w:t>
+        <w:t xml:space="preserve">Content Pillars</w:t>
       </w:r>
     </w:p>
     <w:p>
@@ -1651,7 +1470,7 @@
         </w:numPr>
       </w:pPr>
       <w:r>
-        <w:t xml:space="preserve">Ebook: $37 AUD</w:t>
+        <w:t xml:space="preserve">Body State (Depleted, Transitioning, Ready)</w:t>
       </w:r>
     </w:p>
     <w:p>
@@ -1663,7 +1482,7 @@
         </w:numPr>
       </w:pPr>
       <w:r>
-        <w:t xml:space="preserve">Ebook + Bundle (templates, prompt vault): $47 AUD</w:t>
+        <w:t xml:space="preserve">Why effort isn’t working</w:t>
       </w:r>
     </w:p>
     <w:p>
@@ -1675,7 +1494,41 @@
         </w:numPr>
       </w:pPr>
       <w:r>
-        <w:t xml:space="preserve">Instant digital delivery via Stripe</w:t>
+        <w:t xml:space="preserve">Cortisol and fat storage</w:t>
+      </w:r>
+    </w:p>
+    <w:p>
+      <w:pPr>
+        <w:pStyle w:val="Compact"/>
+        <w:numPr>
+          <w:ilvl w:val="0"/>
+          <w:numId w:val="1004"/>
+        </w:numPr>
+      </w:pPr>
+      <w:r>
+        <w:t xml:space="preserve">Prescription without interpretation</w:t>
+      </w:r>
+    </w:p>
+    <w:p>
+      <w:pPr>
+        <w:pStyle w:val="Compact"/>
+        <w:numPr>
+          <w:ilvl w:val="0"/>
+          <w:numId w:val="1004"/>
+        </w:numPr>
+      </w:pPr>
+      <w:r>
+        <w:t xml:space="preserve">The intelligent approach</w:t>
+      </w:r>
+    </w:p>
+    <w:bookmarkEnd w:id="25"/>
+    <w:bookmarkStart w:id="26" w:name="posting-cadence-1"/>
+    <w:p>
+      <w:pPr>
+        <w:pStyle w:val="Heading3"/>
+      </w:pPr>
+      <w:r>
+        <w:t xml:space="preserve">Posting Cadence</w:t>
       </w:r>
     </w:p>
     <w:p>
@@ -1683,27 +1536,47 @@
         <w:pStyle w:val="FirstParagraph"/>
       </w:pPr>
       <w:r>
-        <w:rPr>
-          <w:b/>
-          <w:bCs/>
-        </w:rPr>
-        <w:t xml:space="preserve">Website:</w:t>
-      </w:r>
-      <w:r>
-        <w:t xml:space="preserve"> </w:t>
-      </w:r>
-      <w:r>
-        <w:t xml:space="preserve">aicofoundermethod.com</w:t>
-      </w:r>
-    </w:p>
-    <w:bookmarkEnd w:id="30"/>
-    <w:bookmarkStart w:id="31" w:name="target-audience-1"/>
+        <w:t xml:space="preserve">5x per week:</w:t>
+      </w:r>
+      <w:r>
+        <w:t xml:space="preserve"> </w:t>
+      </w:r>
+      <w:r>
+        <w:t xml:space="preserve">- Monday: Authority (7am)</w:t>
+      </w:r>
+      <w:r>
+        <w:t xml:space="preserve"> </w:t>
+      </w:r>
+      <w:r>
+        <w:t xml:space="preserve">- Wednesday: Pattern Recognition (12pm)</w:t>
+      </w:r>
+      <w:r>
+        <w:t xml:space="preserve"> </w:t>
+      </w:r>
+      <w:r>
+        <w:t xml:space="preserve">- Friday: Coach Perspective (6pm)</w:t>
+      </w:r>
+      <w:r>
+        <w:t xml:space="preserve"> </w:t>
+      </w:r>
+      <w:r>
+        <w:t xml:space="preserve">- Sunday: Diagnostic - Scorecard CTA (8am)</w:t>
+      </w:r>
+      <w:r>
+        <w:t xml:space="preserve"> </w:t>
+      </w:r>
+      <w:r>
+        <w:t xml:space="preserve">- Tuesday or Thursday: Contrarian or Reels</w:t>
+      </w:r>
+    </w:p>
+    <w:bookmarkEnd w:id="26"/>
+    <w:bookmarkStart w:id="27" w:name="paid-ads"/>
     <w:p>
       <w:pPr>
         <w:pStyle w:val="Heading3"/>
       </w:pPr>
       <w:r>
-        <w:t xml:space="preserve">Target Audience</w:t>
+        <w:t xml:space="preserve">Paid Ads</w:t>
       </w:r>
     </w:p>
     <w:p>
@@ -1711,29 +1584,74 @@
         <w:pStyle w:val="FirstParagraph"/>
       </w:pPr>
       <w:r>
-        <w:t xml:space="preserve">Founders, solopreneurs, business leaders who know AI is important but are using it reactively.</w:t>
-      </w:r>
-      <w:r>
-        <w:t xml:space="preserve"> </w:t>
-      </w:r>
-      <w:r>
-        <w:t xml:space="preserve">Broader than Body Recode — crosses industries.</w:t>
-      </w:r>
-      <w:r>
-        <w:t xml:space="preserve"> </w:t>
-      </w:r>
-      <w:r>
-        <w:t xml:space="preserve">Entry point: anyone building something who wants structured leverage.</w:t>
-      </w:r>
-    </w:p>
-    <w:bookmarkEnd w:id="31"/>
-    <w:bookmarkStart w:id="32" w:name="platform-1"/>
+        <w:t xml:space="preserve">3 ad sets running simultaneously at $10/day each ($30/day total):</w:t>
+      </w:r>
+      <w:r>
+        <w:t xml:space="preserve"> </w:t>
+      </w:r>
+      <w:r>
+        <w:t xml:space="preserve">- Silent Frustration — Statement card</w:t>
+      </w:r>
+      <w:r>
+        <w:t xml:space="preserve"> </w:t>
+      </w:r>
+      <w:r>
+        <w:t xml:space="preserve">- Contrarian — Photo card</w:t>
+      </w:r>
+      <w:r>
+        <w:t xml:space="preserve"> </w:t>
+      </w:r>
+      <w:r>
+        <w:t xml:space="preserve">- Diagnosis — Body states carousel (3 slides)</w:t>
+      </w:r>
+    </w:p>
+    <w:p>
+      <w:pPr>
+        <w:pStyle w:val="BodyText"/>
+      </w:pPr>
+      <w:r>
+        <w:t xml:space="preserve">All destination URLs tracked by source.</w:t>
+      </w:r>
+      <w:r>
+        <w:t xml:space="preserve"> </w:t>
+      </w:r>
+      <w:r>
+        <w:t xml:space="preserve">Run 14 days before evaluating. Cut 2 underperformers. Scale winner.</w:t>
+      </w:r>
+    </w:p>
+    <w:p>
+      <w:pPr>
+        <w:pStyle w:val="BodyText"/>
+      </w:pPr>
+      <w:r>
+        <w:t xml:space="preserve">Ads trigger: 3 scorecard submissions per week for 2 consecutive weeks.</w:t>
+      </w:r>
+    </w:p>
+    <w:p>
+      <w:r>
+        <w:pict>
+          <v:rect style="width:0;height:1.5pt" o:hralign="center" o:hrstd="t" o:hr="t"/>
+        </w:pict>
+      </w:r>
+    </w:p>
+    <w:bookmarkEnd w:id="27"/>
+    <w:bookmarkEnd w:id="28"/>
+    <w:bookmarkStart w:id="36" w:name="brand-3-ai-co-founder-method"/>
+    <w:p>
+      <w:pPr>
+        <w:pStyle w:val="Heading2"/>
+      </w:pPr>
+      <w:r>
+        <w:t xml:space="preserve">BRAND 3 — AI CO-FOUNDER METHOD</w:t>
+      </w:r>
+    </w:p>
+    <w:bookmarkStart w:id="29" w:name="positioning-2"/>
     <w:p>
       <w:pPr>
         <w:pStyle w:val="Heading3"/>
       </w:pPr>
       <w:r>
-        <w:t xml:space="preserve">Platform</w:t>
+        <w:t xml:space="preserve">Positioning</w:t>
       </w:r>
     </w:p>
     <w:p>
@@ -1741,35 +1659,31 @@
         <w:pStyle w:val="FirstParagraph"/>
       </w:pPr>
       <w:r>
-        <w:t xml:space="preserve">Shared with personal brand initially —</w:t>
-      </w:r>
-      <w:r>
-        <w:t xml:space="preserve"> </w:t>
-      </w:r>
-      <w:r>
-        <w:t xml:space="preserve">@kade_dunstone_</w:t>
-      </w:r>
-      <w:r>
-        <w:t xml:space="preserve"> </w:t>
-      </w:r>
-      <w:r>
-        <w:t xml:space="preserve">feeds into this product.</w:t>
-      </w:r>
-      <w:r>
-        <w:t xml:space="preserve"> </w:t>
-      </w:r>
-      <w:r>
-        <w:t xml:space="preserve">No separate social account needed at this stage.</w:t>
-      </w:r>
-    </w:p>
-    <w:bookmarkEnd w:id="32"/>
-    <w:bookmarkStart w:id="33" w:name="content-angles"/>
+        <w:t xml:space="preserve">A structured framework for founders and business leaders who want to use AI strategically — not randomly.</w:t>
+      </w:r>
+    </w:p>
+    <w:p>
+      <w:pPr>
+        <w:pStyle w:val="BodyText"/>
+      </w:pPr>
+      <w:r>
+        <w:t xml:space="preserve">Not a prompt guide. Not a tool tutorial.</w:t>
+      </w:r>
+      <w:r>
+        <w:t xml:space="preserve"> </w:t>
+      </w:r>
+      <w:r>
+        <w:t xml:space="preserve">A system for integrating AI as a thinking partner across the entire business.</w:t>
+      </w:r>
+    </w:p>
+    <w:bookmarkEnd w:id="29"/>
+    <w:bookmarkStart w:id="30" w:name="product"/>
     <w:p>
       <w:pPr>
         <w:pStyle w:val="Heading3"/>
       </w:pPr>
       <w:r>
-        <w:t xml:space="preserve">Content Angles</w:t>
+        <w:t xml:space="preserve">Product</w:t>
       </w:r>
     </w:p>
     <w:p>
@@ -1781,7 +1695,7 @@
         </w:numPr>
       </w:pPr>
       <w:r>
-        <w:t xml:space="preserve">“AI doesn’t make you smarter. It makes your current thinking louder.”</w:t>
+        <w:t xml:space="preserve">Ebook: $37 AUD</w:t>
       </w:r>
     </w:p>
     <w:p>
@@ -1793,7 +1707,7 @@
         </w:numPr>
       </w:pPr>
       <w:r>
-        <w:t xml:space="preserve">The difference between using AI as a tool vs a co-founder</w:t>
+        <w:t xml:space="preserve">Ebook + Bundle (templates, prompt vault): $47 AUD</w:t>
       </w:r>
     </w:p>
     <w:p>
@@ -1805,53 +1719,35 @@
         </w:numPr>
       </w:pPr>
       <w:r>
-        <w:t xml:space="preserve">What happens when you give AI a role instead of a question</w:t>
-      </w:r>
-    </w:p>
-    <w:p>
-      <w:pPr>
-        <w:pStyle w:val="Compact"/>
-        <w:numPr>
-          <w:ilvl w:val="0"/>
-          <w:numId w:val="1005"/>
-        </w:numPr>
-      </w:pPr>
-      <w:r>
-        <w:t xml:space="preserve">Building repeatable workflows vs one-off prompts</w:t>
-      </w:r>
-    </w:p>
-    <w:p>
-      <w:pPr>
-        <w:pStyle w:val="Compact"/>
-        <w:numPr>
-          <w:ilvl w:val="0"/>
-          <w:numId w:val="1005"/>
-        </w:numPr>
-      </w:pPr>
-      <w:r>
-        <w:t xml:space="preserve">The IP extraction process — Pause, Reflect, Document</w:t>
-      </w:r>
-    </w:p>
-    <w:p>
-      <w:pPr>
-        <w:pStyle w:val="Compact"/>
-        <w:numPr>
-          <w:ilvl w:val="0"/>
-          <w:numId w:val="1005"/>
-        </w:numPr>
-      </w:pPr>
-      <w:r>
-        <w:t xml:space="preserve">How Kade uses AI to build Body Recode</w:t>
-      </w:r>
-    </w:p>
-    <w:bookmarkEnd w:id="33"/>
-    <w:bookmarkStart w:id="34" w:name="funnel-1"/>
+        <w:t xml:space="preserve">Instant digital delivery via Stripe</w:t>
+      </w:r>
+    </w:p>
+    <w:p>
+      <w:pPr>
+        <w:pStyle w:val="FirstParagraph"/>
+      </w:pPr>
+      <w:r>
+        <w:rPr>
+          <w:b/>
+          <w:bCs/>
+        </w:rPr>
+        <w:t xml:space="preserve">Website:</w:t>
+      </w:r>
+      <w:r>
+        <w:t xml:space="preserve"> </w:t>
+      </w:r>
+      <w:r>
+        <w:t xml:space="preserve">aicofoundermethod.com</w:t>
+      </w:r>
+    </w:p>
+    <w:bookmarkEnd w:id="30"/>
+    <w:bookmarkStart w:id="31" w:name="target-audience-1"/>
     <w:p>
       <w:pPr>
         <w:pStyle w:val="Heading3"/>
       </w:pPr>
       <w:r>
-        <w:t xml:space="preserve">Funnel</w:t>
+        <w:t xml:space="preserve">Target Audience</w:t>
       </w:r>
     </w:p>
     <w:p>
@@ -1859,25 +1755,29 @@
         <w:pStyle w:val="FirstParagraph"/>
       </w:pPr>
       <w:r>
-        <w:t xml:space="preserve">Personal brand content (Threads + Instagram Pillar 3) → aicofoundermethod.com → $37-47 purchase</w:t>
-      </w:r>
-    </w:p>
-    <w:p>
-      <w:pPr>
-        <w:pStyle w:val="BodyText"/>
-      </w:pPr>
-      <w:r>
-        <w:t xml:space="preserve">Low friction. No discovery call. No application. Straight to checkout.</w:t>
-      </w:r>
-    </w:p>
-    <w:bookmarkEnd w:id="34"/>
-    <w:bookmarkStart w:id="35" w:name="ads-future"/>
+        <w:t xml:space="preserve">Founders, solopreneurs, business leaders who know AI is important but are using it reactively.</w:t>
+      </w:r>
+      <w:r>
+        <w:t xml:space="preserve"> </w:t>
+      </w:r>
+      <w:r>
+        <w:t xml:space="preserve">Broader than Body Recode — crosses industries.</w:t>
+      </w:r>
+      <w:r>
+        <w:t xml:space="preserve"> </w:t>
+      </w:r>
+      <w:r>
+        <w:t xml:space="preserve">Entry point: anyone building something who wants structured leverage.</w:t>
+      </w:r>
+    </w:p>
+    <w:bookmarkEnd w:id="31"/>
+    <w:bookmarkStart w:id="32" w:name="platform-1"/>
     <w:p>
       <w:pPr>
         <w:pStyle w:val="Heading3"/>
       </w:pPr>
       <w:r>
-        <w:t xml:space="preserve">Ads (future)</w:t>
+        <w:t xml:space="preserve">Platform</w:t>
       </w:r>
     </w:p>
     <w:p>
@@ -1885,46 +1785,35 @@
         <w:pStyle w:val="FirstParagraph"/>
       </w:pPr>
       <w:r>
-        <w:t xml:space="preserve">Once Body Recode ads are optimised, run a separate Meta campaign for AI Co-Founder Method.</w:t>
-      </w:r>
-      <w:r>
-        <w:t xml:space="preserve"> </w:t>
-      </w:r>
-      <w:r>
-        <w:t xml:space="preserve">Cold traffic → landing page → purchase.</w:t>
-      </w:r>
-      <w:r>
-        <w:t xml:space="preserve"> </w:t>
-      </w:r>
-      <w:r>
-        <w:t xml:space="preserve">Price point allows direct purchase without a funnel.</w:t>
-      </w:r>
-    </w:p>
-    <w:p>
-      <w:r>
-        <w:pict>
-          <v:rect style="width:0;height:1.5pt" o:hralign="center" o:hrstd="t" o:hr="t"/>
-        </w:pict>
-      </w:r>
-    </w:p>
-    <w:bookmarkEnd w:id="35"/>
-    <w:bookmarkEnd w:id="36"/>
-    <w:bookmarkStart w:id="40" w:name="the-ecosystem-logic"/>
-    <w:p>
-      <w:pPr>
-        <w:pStyle w:val="Heading2"/>
-      </w:pPr>
-      <w:r>
-        <w:t xml:space="preserve">THE ECOSYSTEM LOGIC</w:t>
-      </w:r>
-    </w:p>
-    <w:bookmarkStart w:id="37" w:name="how-the-three-brands-work-together"/>
+        <w:t xml:space="preserve">Shared with personal brand initially —</w:t>
+      </w:r>
+      <w:r>
+        <w:t xml:space="preserve"> </w:t>
+      </w:r>
+      <w:r>
+        <w:t xml:space="preserve">@kade_dunstone_</w:t>
+      </w:r>
+      <w:r>
+        <w:t xml:space="preserve"> </w:t>
+      </w:r>
+      <w:r>
+        <w:t xml:space="preserve">feeds into this product.</w:t>
+      </w:r>
+      <w:r>
+        <w:t xml:space="preserve"> </w:t>
+      </w:r>
+      <w:r>
+        <w:t xml:space="preserve">No separate social account needed at this stage.</w:t>
+      </w:r>
+    </w:p>
+    <w:bookmarkEnd w:id="32"/>
+    <w:bookmarkStart w:id="33" w:name="content-angles"/>
     <w:p>
       <w:pPr>
         <w:pStyle w:val="Heading3"/>
       </w:pPr>
       <w:r>
-        <w:t xml:space="preserve">How the three brands work together</w:t>
+        <w:t xml:space="preserve">Content Angles</w:t>
       </w:r>
     </w:p>
     <w:p>
@@ -1936,19 +1825,7 @@
         </w:numPr>
       </w:pPr>
       <w:r>
-        <w:t xml:space="preserve">Someone discovers</w:t>
-      </w:r>
-      <w:r>
-        <w:t xml:space="preserve"> </w:t>
-      </w:r>
-      <w:r>
-        <w:t xml:space="preserve">@kade_dunstone_</w:t>
-      </w:r>
-      <w:r>
-        <w:t xml:space="preserve"> </w:t>
-      </w:r>
-      <w:r>
-        <w:t xml:space="preserve">through a post about performance, identity, or AI</w:t>
+        <w:t xml:space="preserve">“AI doesn’t make you smarter. It makes your current thinking louder.”</w:t>
       </w:r>
     </w:p>
     <w:p>
@@ -1960,7 +1837,7 @@
         </w:numPr>
       </w:pPr>
       <w:r>
-        <w:t xml:space="preserve">They follow because the thinking resonates</w:t>
+        <w:t xml:space="preserve">The difference between using AI as a tool vs a co-founder</w:t>
       </w:r>
     </w:p>
     <w:p>
@@ -1972,7 +1849,7 @@
         </w:numPr>
       </w:pPr>
       <w:r>
-        <w:t xml:space="preserve">Over time they encounter Body Recode through performance content</w:t>
+        <w:t xml:space="preserve">What happens when you give AI a role instead of a question</w:t>
       </w:r>
     </w:p>
     <w:p>
@@ -1984,7 +1861,7 @@
         </w:numPr>
       </w:pPr>
       <w:r>
-        <w:t xml:space="preserve">Or they encounter AI Co-Founder Method through AI and leverage content</w:t>
+        <w:t xml:space="preserve">Building repeatable workflows vs one-off prompts</w:t>
       </w:r>
     </w:p>
     <w:p>
@@ -1996,7 +1873,7 @@
         </w:numPr>
       </w:pPr>
       <w:r>
-        <w:t xml:space="preserve">They buy or apply based on which problem is most relevant to them right now</w:t>
+        <w:t xml:space="preserve">The IP extraction process — Pause, Reflect, Document</w:t>
       </w:r>
     </w:p>
     <w:p>
@@ -2005,6 +1882,173 @@
         <w:numPr>
           <w:ilvl w:val="0"/>
           <w:numId w:val="1006"/>
+        </w:numPr>
+      </w:pPr>
+      <w:r>
+        <w:t xml:space="preserve">How Kade uses AI to build Body Recode</w:t>
+      </w:r>
+    </w:p>
+    <w:bookmarkEnd w:id="33"/>
+    <w:bookmarkStart w:id="34" w:name="funnel-1"/>
+    <w:p>
+      <w:pPr>
+        <w:pStyle w:val="Heading3"/>
+      </w:pPr>
+      <w:r>
+        <w:t xml:space="preserve">Funnel</w:t>
+      </w:r>
+    </w:p>
+    <w:p>
+      <w:pPr>
+        <w:pStyle w:val="FirstParagraph"/>
+      </w:pPr>
+      <w:r>
+        <w:t xml:space="preserve">Personal brand content (Threads + Instagram Pillar 3) → aicofoundermethod.com → $37-47 purchase</w:t>
+      </w:r>
+    </w:p>
+    <w:p>
+      <w:pPr>
+        <w:pStyle w:val="BodyText"/>
+      </w:pPr>
+      <w:r>
+        <w:t xml:space="preserve">Low friction. No discovery call. No application. Straight to checkout.</w:t>
+      </w:r>
+    </w:p>
+    <w:bookmarkEnd w:id="34"/>
+    <w:bookmarkStart w:id="35" w:name="ads-future"/>
+    <w:p>
+      <w:pPr>
+        <w:pStyle w:val="Heading3"/>
+      </w:pPr>
+      <w:r>
+        <w:t xml:space="preserve">Ads (future)</w:t>
+      </w:r>
+    </w:p>
+    <w:p>
+      <w:pPr>
+        <w:pStyle w:val="FirstParagraph"/>
+      </w:pPr>
+      <w:r>
+        <w:t xml:space="preserve">Once Body Recode ads are optimised, run a separate Meta campaign for AI Co-Founder Method.</w:t>
+      </w:r>
+      <w:r>
+        <w:t xml:space="preserve"> </w:t>
+      </w:r>
+      <w:r>
+        <w:t xml:space="preserve">Cold traffic → landing page → purchase.</w:t>
+      </w:r>
+      <w:r>
+        <w:t xml:space="preserve"> </w:t>
+      </w:r>
+      <w:r>
+        <w:t xml:space="preserve">Price point allows direct purchase without a funnel.</w:t>
+      </w:r>
+    </w:p>
+    <w:p>
+      <w:r>
+        <w:pict>
+          <v:rect style="width:0;height:1.5pt" o:hralign="center" o:hrstd="t" o:hr="t"/>
+        </w:pict>
+      </w:r>
+    </w:p>
+    <w:bookmarkEnd w:id="35"/>
+    <w:bookmarkEnd w:id="36"/>
+    <w:bookmarkStart w:id="40" w:name="the-ecosystem-logic"/>
+    <w:p>
+      <w:pPr>
+        <w:pStyle w:val="Heading2"/>
+      </w:pPr>
+      <w:r>
+        <w:t xml:space="preserve">THE ECOSYSTEM LOGIC</w:t>
+      </w:r>
+    </w:p>
+    <w:bookmarkStart w:id="37" w:name="how-the-three-brands-work-together"/>
+    <w:p>
+      <w:pPr>
+        <w:pStyle w:val="Heading3"/>
+      </w:pPr>
+      <w:r>
+        <w:t xml:space="preserve">How the three brands work together</w:t>
+      </w:r>
+    </w:p>
+    <w:p>
+      <w:pPr>
+        <w:pStyle w:val="Compact"/>
+        <w:numPr>
+          <w:ilvl w:val="0"/>
+          <w:numId w:val="1007"/>
+        </w:numPr>
+      </w:pPr>
+      <w:r>
+        <w:t xml:space="preserve">Someone discovers</w:t>
+      </w:r>
+      <w:r>
+        <w:t xml:space="preserve"> </w:t>
+      </w:r>
+      <w:r>
+        <w:t xml:space="preserve">@kade_dunstone_</w:t>
+      </w:r>
+      <w:r>
+        <w:t xml:space="preserve"> </w:t>
+      </w:r>
+      <w:r>
+        <w:t xml:space="preserve">through a post about performance, identity, or AI</w:t>
+      </w:r>
+    </w:p>
+    <w:p>
+      <w:pPr>
+        <w:pStyle w:val="Compact"/>
+        <w:numPr>
+          <w:ilvl w:val="0"/>
+          <w:numId w:val="1007"/>
+        </w:numPr>
+      </w:pPr>
+      <w:r>
+        <w:t xml:space="preserve">They follow because the thinking resonates</w:t>
+      </w:r>
+    </w:p>
+    <w:p>
+      <w:pPr>
+        <w:pStyle w:val="Compact"/>
+        <w:numPr>
+          <w:ilvl w:val="0"/>
+          <w:numId w:val="1007"/>
+        </w:numPr>
+      </w:pPr>
+      <w:r>
+        <w:t xml:space="preserve">Over time they encounter Body Recode through performance content</w:t>
+      </w:r>
+    </w:p>
+    <w:p>
+      <w:pPr>
+        <w:pStyle w:val="Compact"/>
+        <w:numPr>
+          <w:ilvl w:val="0"/>
+          <w:numId w:val="1007"/>
+        </w:numPr>
+      </w:pPr>
+      <w:r>
+        <w:t xml:space="preserve">Or they encounter AI Co-Founder Method through AI and leverage content</w:t>
+      </w:r>
+    </w:p>
+    <w:p>
+      <w:pPr>
+        <w:pStyle w:val="Compact"/>
+        <w:numPr>
+          <w:ilvl w:val="0"/>
+          <w:numId w:val="1007"/>
+        </w:numPr>
+      </w:pPr>
+      <w:r>
+        <w:t xml:space="preserve">They buy or apply based on which problem is most relevant to them right now</w:t>
+      </w:r>
+    </w:p>
+    <w:p>
+      <w:pPr>
+        <w:pStyle w:val="Compact"/>
+        <w:numPr>
+          <w:ilvl w:val="0"/>
+          <w:numId w:val="1007"/>
         </w:numPr>
       </w:pPr>
       <w:r>
@@ -2329,7 +2373,7 @@
         <w:pStyle w:val="Compact"/>
         <w:numPr>
           <w:ilvl w:val="0"/>
-          <w:numId w:val="1007"/>
+          <w:numId w:val="1008"/>
         </w:numPr>
       </w:pPr>
       <w:r>
@@ -2341,7 +2385,7 @@
         <w:pStyle w:val="Compact"/>
         <w:numPr>
           <w:ilvl w:val="0"/>
-          <w:numId w:val="1007"/>
+          <w:numId w:val="1008"/>
         </w:numPr>
       </w:pPr>
       <w:r>
@@ -2353,7 +2397,7 @@
         <w:pStyle w:val="Compact"/>
         <w:numPr>
           <w:ilvl w:val="0"/>
-          <w:numId w:val="1007"/>
+          <w:numId w:val="1008"/>
         </w:numPr>
       </w:pPr>
       <w:r>
@@ -2365,7 +2409,7 @@
         <w:pStyle w:val="Compact"/>
         <w:numPr>
           <w:ilvl w:val="0"/>
-          <w:numId w:val="1007"/>
+          <w:numId w:val="1008"/>
         </w:numPr>
       </w:pPr>
       <w:r>
@@ -2841,6 +2885,9 @@
     </w:lvlOverride>
   </w:num>
   <w:num w:numId="1003">
+    <w:abstractNumId w:val="991"/>
+  </w:num>
+  <w:num w:numId="1004">
     <w:abstractNumId w:val="99411"/>
     <w:lvlOverride w:ilvl="0">
       <w:startOverride w:val="1"/>
@@ -2870,13 +2917,13 @@
       <w:startOverride w:val="1"/>
     </w:lvlOverride>
   </w:num>
-  <w:num w:numId="1004">
-    <w:abstractNumId w:val="991"/>
-  </w:num>
   <w:num w:numId="1005">
     <w:abstractNumId w:val="991"/>
   </w:num>
   <w:num w:numId="1006">
+    <w:abstractNumId w:val="991"/>
+  </w:num>
+  <w:num w:numId="1007">
     <w:abstractNumId w:val="99411"/>
     <w:lvlOverride w:ilvl="0">
       <w:startOverride w:val="1"/>
@@ -2906,7 +2953,7 @@
       <w:startOverride w:val="1"/>
     </w:lvlOverride>
   </w:num>
-  <w:num w:numId="1007">
+  <w:num w:numId="1008">
     <w:abstractNumId w:val="991"/>
   </w:num>
 </w:numbering>

</xml_diff>